<commit_message>
Bundle front-end libraries locally and float notifications
- Bootstrap 5.3.3, Bootstrap Icons 1.11.3, Chart.js 4.4.4 and the Inter /
  JetBrains Mono fonts now live in static/vendor, so NetOps works offline
- Messages render in a fixed bottom-left stack, visible after Investigate and
  Resolve redirects to #incidents, and auto-close after 12 seconds
- README and build guide updated

Co-Authored-By: Claude Opus 5.5 <noreply@anthropic.com>
Claude-Session: https://claude.ai/code/session_01SySPYDD5S1JRdwKU5i2yeg
</commit_message>
<xml_diff>
--- a/NetOps_Project_Build_Guide.docx
+++ b/NetOps_Project_Build_Guide.docx
@@ -1776,7 +1776,19 @@
               <w:jc w:val="left"/>
             </w:pPr>
             <w:r>
-              <w:t xml:space="preserve">Grid, tables, alerts and buttons in all templates (loaded from a CDN)</w:t>
+              <w:t xml:space="preserve">Grid, tables, alerts and buttons in all templates (stored locally in</w:t>
+            </w:r>
+            <w:r>
+              <w:t xml:space="preserve"> </w:t>
+            </w:r>
+            <w:r>
+              <w:rPr>
+                <w:rStyle w:val="VerbatimChar"/>
+              </w:rPr>
+              <w:t xml:space="preserve">static/vendor</w:t>
+            </w:r>
+            <w:r>
+              <w:t xml:space="preserve">)</w:t>
             </w:r>
           </w:p>
         </w:tc>
@@ -2102,13 +2114,28 @@
           <w:bCs/>
           <w:b/>
         </w:rPr>
-        <w:t xml:space="preserve">Bootstrap and Chart.js</w:t>
-      </w:r>
-      <w:r>
-        <w:t xml:space="preserve"> </w:t>
-      </w:r>
-      <w:r>
-        <w:t xml:space="preserve">are loaded from a</w:t>
+        <w:t xml:space="preserve">Bootstrap, Bootstrap Icons, Chart.js and the fonts are stored inside the project</w:t>
+      </w:r>
+      <w:r>
+        <w:t xml:space="preserve"> </w:t>
+      </w:r>
+      <w:r>
+        <w:t xml:space="preserve">in</w:t>
+      </w:r>
+      <w:r>
+        <w:t xml:space="preserve"> </w:t>
+      </w:r>
+      <w:r>
+        <w:rPr>
+          <w:rStyle w:val="VerbatimChar"/>
+        </w:rPr>
+        <w:t xml:space="preserve">static/vendor/</w:t>
+      </w:r>
+      <w:r>
+        <w:t xml:space="preserve"> </w:t>
+      </w:r>
+      <w:r>
+        <w:t xml:space="preserve">and served by Django like our own CSS and JS. The page makes</w:t>
       </w:r>
       <w:r>
         <w:t xml:space="preserve"> </w:t>
@@ -2118,13 +2145,10 @@
           <w:bCs/>
           <w:b/>
         </w:rPr>
-        <w:t xml:space="preserve">CDN</w:t>
-      </w:r>
-      <w:r>
-        <w:t xml:space="preserve"> </w:t>
-      </w:r>
-      <w:r>
-        <w:t xml:space="preserve">(Content Delivery Network, jsdelivr.net), so the laptop needs internet access the first time the page loads. NetOps itself still runs locally.</w:t>
+        <w:t xml:space="preserve">no requests to the internet</w:t>
+      </w:r>
+      <w:r>
+        <w:t xml:space="preserve">, so NetOps works with Wi-Fi switched off. (They were first loaded from a CDN, a Content Delivery Network; see Problem 5 in Phase 18 for why that changed.)</w:t>
       </w:r>
     </w:p>
     <w:p>
@@ -4595,7 +4619,61 @@
         <w:rPr>
           <w:rStyle w:val="VerbatimChar"/>
         </w:rPr>
-        <w:t xml:space="preserve">    └── js/dashboard.js</w:t>
+        <w:t xml:space="preserve">    ├── css/fonts.css            ← @font-face rules for the local fonts</w:t>
+      </w:r>
+      <w:r>
+        <w:br/>
+      </w:r>
+      <w:r>
+        <w:rPr>
+          <w:rStyle w:val="VerbatimChar"/>
+        </w:rPr>
+        <w:t xml:space="preserve">    ├── js/dashboard.js</w:t>
+      </w:r>
+      <w:r>
+        <w:br/>
+      </w:r>
+      <w:r>
+        <w:rPr>
+          <w:rStyle w:val="VerbatimChar"/>
+        </w:rPr>
+        <w:t xml:space="preserve">    └── vendor/                  ← local copies of third-party libraries</w:t>
+      </w:r>
+      <w:r>
+        <w:br/>
+      </w:r>
+      <w:r>
+        <w:rPr>
+          <w:rStyle w:val="VerbatimChar"/>
+        </w:rPr>
+        <w:t xml:space="preserve">        ├── bootstrap/           (bootstrap.min.css, bootstrap.bundle.min.js, v5.3.3)</w:t>
+      </w:r>
+      <w:r>
+        <w:br/>
+      </w:r>
+      <w:r>
+        <w:rPr>
+          <w:rStyle w:val="VerbatimChar"/>
+        </w:rPr>
+        <w:t xml:space="preserve">        ├── bootstrap-icons/     (bootstrap-icons.min.css + fonts/, v1.11.3)</w:t>
+      </w:r>
+      <w:r>
+        <w:br/>
+      </w:r>
+      <w:r>
+        <w:rPr>
+          <w:rStyle w:val="VerbatimChar"/>
+        </w:rPr>
+        <w:t xml:space="preserve">        ├── chartjs/             (chart.umd.min.js, v4.4.4)</w:t>
+      </w:r>
+      <w:r>
+        <w:br/>
+      </w:r>
+      <w:r>
+        <w:rPr>
+          <w:rStyle w:val="VerbatimChar"/>
+        </w:rPr>
+        <w:t xml:space="preserve">        └── fonts/               (Inter 400–700, JetBrains Mono 400/600, .woff2)</w:t>
       </w:r>
     </w:p>
     <w:p>
@@ -15856,7 +15934,22 @@
         <w:pStyle w:val="Compact"/>
       </w:pPr>
       <w:r>
-        <w:t xml:space="preserve">Loads Bootstrap 5, Bootstrap Icons and Google Fonts (Inter, JetBrains Mono) from CDNs, plus our</w:t>
+        <w:t xml:space="preserve">Loads Bootstrap 5, Bootstrap Icons, our</w:t>
+      </w:r>
+      <w:r>
+        <w:t xml:space="preserve"> </w:t>
+      </w:r>
+      <w:r>
+        <w:rPr>
+          <w:rStyle w:val="VerbatimChar"/>
+        </w:rPr>
+        <w:t xml:space="preserve">fonts.css</w:t>
+      </w:r>
+      <w:r>
+        <w:t xml:space="preserve"> </w:t>
+      </w:r>
+      <w:r>
+        <w:t xml:space="preserve">(Inter and JetBrains Mono) and our</w:t>
       </w:r>
       <w:r>
         <w:t xml:space="preserve"> </w:t>
@@ -15868,7 +15961,50 @@
         <w:t xml:space="preserve">styles.css</w:t>
       </w:r>
       <w:r>
-        <w:t xml:space="preserve">.</w:t>
+        <w:t xml:space="preserve">, all</w:t>
+      </w:r>
+      <w:r>
+        <w:t xml:space="preserve"> </w:t>
+      </w:r>
+      <w:r>
+        <w:rPr>
+          <w:bCs/>
+          <w:b/>
+        </w:rPr>
+        <w:t xml:space="preserve">from</w:t>
+      </w:r>
+      <w:r>
+        <w:rPr>
+          <w:bCs/>
+          <w:b/>
+        </w:rPr>
+        <w:t xml:space="preserve"> </w:t>
+      </w:r>
+      <w:r>
+        <w:rPr>
+          <w:rStyle w:val="VerbatimChar"/>
+          <w:bCs/>
+          <w:b/>
+        </w:rPr>
+        <w:t xml:space="preserve">static/</w:t>
+      </w:r>
+      <w:r>
+        <w:t xml:space="preserve"> </w:t>
+      </w:r>
+      <w:r>
+        <w:t xml:space="preserve">with</w:t>
+      </w:r>
+      <w:r>
+        <w:t xml:space="preserve"> </w:t>
+      </w:r>
+      <w:r>
+        <w:rPr>
+          <w:rStyle w:val="VerbatimChar"/>
+        </w:rPr>
+        <w:t xml:space="preserve">{% static '...' %}</w:t>
+      </w:r>
+      <w:r>
+        <w:t xml:space="preserve">. Nothing is loaded from the internet.</w:t>
       </w:r>
     </w:p>
     <w:p>
@@ -15958,7 +16094,7 @@
           <w:bCs/>
           <w:b/>
         </w:rPr>
-        <w:t xml:space="preserve">Messages:</w:t>
+        <w:t xml:space="preserve">Messages (floating notifications):</w:t>
       </w:r>
       <w:r>
         <w:t xml:space="preserve"> </w:t>
@@ -16009,7 +16145,84 @@
         <w:t xml:space="preserve">alert-info</w:t>
       </w:r>
       <w:r>
-        <w:t xml:space="preserve">).</w:t>
+        <w:t xml:space="preserve">) inside a</w:t>
+      </w:r>
+      <w:r>
+        <w:t xml:space="preserve"> </w:t>
+      </w:r>
+      <w:r>
+        <w:rPr>
+          <w:rStyle w:val="VerbatimChar"/>
+        </w:rPr>
+        <w:t xml:space="preserve">.message-stack</w:t>
+      </w:r>
+      <w:r>
+        <w:t xml:space="preserve"> </w:t>
+      </w:r>
+      <w:r>
+        <w:t xml:space="preserve">container that is</w:t>
+      </w:r>
+      <w:r>
+        <w:t xml:space="preserve"> </w:t>
+      </w:r>
+      <w:r>
+        <w:rPr>
+          <w:bCs/>
+          <w:b/>
+        </w:rPr>
+        <w:t xml:space="preserve">fixed to the bottom-left of the screen</w:t>
+      </w:r>
+      <w:r>
+        <w:t xml:space="preserve"> </w:t>
+      </w:r>
+      <w:r>
+        <w:t xml:space="preserve">(</w:t>
+      </w:r>
+      <w:r>
+        <w:rPr>
+          <w:rStyle w:val="VerbatimChar"/>
+        </w:rPr>
+        <w:t xml:space="preserve">position: fixed</w:t>
+      </w:r>
+      <w:r>
+        <w:t xml:space="preserve"> </w:t>
+      </w:r>
+      <w:r>
+        <w:t xml:space="preserve">in</w:t>
+      </w:r>
+      <w:r>
+        <w:t xml:space="preserve"> </w:t>
+      </w:r>
+      <w:r>
+        <w:rPr>
+          <w:rStyle w:val="VerbatimChar"/>
+        </w:rPr>
+        <w:t xml:space="preserve">styles.css</w:t>
+      </w:r>
+      <w:r>
+        <w:t xml:space="preserve">). Because it floats, the notification is visible even when the page reopens scrolled down to the incidents table (</w:t>
+      </w:r>
+      <w:r>
+        <w:rPr>
+          <w:rStyle w:val="VerbatimChar"/>
+        </w:rPr>
+        <w:t xml:space="preserve">#incidents</w:t>
+      </w:r>
+      <w:r>
+        <w:t xml:space="preserve">) after Investigate or Resolve. It sits at the bottom-left so it never covers the Simulate/Reset buttons (top-right) or the Resolve buttons (right). A small script closes the notifications automatically after</w:t>
+      </w:r>
+      <w:r>
+        <w:t xml:space="preserve"> </w:t>
+      </w:r>
+      <w:r>
+        <w:rPr>
+          <w:bCs/>
+          <w:b/>
+        </w:rPr>
+        <w:t xml:space="preserve">12 seconds</w:t>
+      </w:r>
+      <w:r>
+        <w:t xml:space="preserve">; the X closes them at once.</w:t>
       </w:r>
     </w:p>
     <w:p>
@@ -21419,6 +21632,154 @@
           </w:p>
         </w:tc>
       </w:tr>
+      <w:tr>
+        <w:tc>
+          <w:tcPr/>
+          <w:p>
+            <w:pPr>
+              <w:pStyle w:val="Compact"/>
+              <w:jc w:val="left"/>
+            </w:pPr>
+            <w:r>
+              <w:rPr>
+                <w:bCs/>
+                <w:b/>
+              </w:rPr>
+              <w:t xml:space="preserve">Offline check:</w:t>
+            </w:r>
+            <w:r>
+              <w:t xml:space="preserve"> </w:t>
+            </w:r>
+            <w:r>
+              <w:t xml:space="preserve">all 14 page requests served from</w:t>
+            </w:r>
+            <w:r>
+              <w:t xml:space="preserve"> </w:t>
+            </w:r>
+            <w:r>
+              <w:rPr>
+                <w:rStyle w:val="VerbatimChar"/>
+              </w:rPr>
+              <w:t xml:space="preserve">127.0.0.1</w:t>
+            </w:r>
+            <w:r>
+              <w:t xml:space="preserve">; 0 external requests; fonts, icons and all 3 charts load</w:t>
+            </w:r>
+          </w:p>
+        </w:tc>
+        <w:tc>
+          <w:tcPr/>
+          <w:p>
+            <w:pPr>
+              <w:pStyle w:val="Compact"/>
+              <w:jc w:val="left"/>
+            </w:pPr>
+            <w:r>
+              <w:t xml:space="preserve">✅</w:t>
+            </w:r>
+          </w:p>
+        </w:tc>
+      </w:tr>
+      <w:tr>
+        <w:tc>
+          <w:tcPr/>
+          <w:p>
+            <w:pPr>
+              <w:pStyle w:val="Compact"/>
+              <w:jc w:val="left"/>
+            </w:pPr>
+            <w:r>
+              <w:rPr>
+                <w:bCs/>
+                <w:b/>
+              </w:rPr>
+              <w:t xml:space="preserve">Notifications:</w:t>
+            </w:r>
+            <w:r>
+              <w:t xml:space="preserve"> </w:t>
+            </w:r>
+            <w:r>
+              <w:t xml:space="preserve">visible bottom-left after Simulate, Investigate and Resolve (even when the page jumps to</w:t>
+            </w:r>
+            <w:r>
+              <w:t xml:space="preserve"> </w:t>
+            </w:r>
+            <w:r>
+              <w:rPr>
+                <w:rStyle w:val="VerbatimChar"/>
+              </w:rPr>
+              <w:t xml:space="preserve">#incidents</w:t>
+            </w:r>
+            <w:r>
+              <w:t xml:space="preserve">); auto-close after 12 s</w:t>
+            </w:r>
+          </w:p>
+        </w:tc>
+        <w:tc>
+          <w:tcPr/>
+          <w:p>
+            <w:pPr>
+              <w:pStyle w:val="Compact"/>
+              <w:jc w:val="left"/>
+            </w:pPr>
+            <w:r>
+              <w:t xml:space="preserve">✅</w:t>
+            </w:r>
+          </w:p>
+        </w:tc>
+      </w:tr>
+      <w:tr>
+        <w:tc>
+          <w:tcPr/>
+          <w:p>
+            <w:pPr>
+              <w:pStyle w:val="Compact"/>
+              <w:jc w:val="left"/>
+            </w:pPr>
+            <w:r>
+              <w:t xml:space="preserve">Simulate escalation seen live: Backup Server Warning → Critical, INC-0001 escalated (no duplicate)</w:t>
+            </w:r>
+          </w:p>
+        </w:tc>
+        <w:tc>
+          <w:tcPr/>
+          <w:p>
+            <w:pPr>
+              <w:pStyle w:val="Compact"/>
+              <w:jc w:val="left"/>
+            </w:pPr>
+            <w:r>
+              <w:t xml:space="preserve">✅</w:t>
+            </w:r>
+          </w:p>
+        </w:tc>
+      </w:tr>
+      <w:tr>
+        <w:tc>
+          <w:tcPr/>
+          <w:p>
+            <w:pPr>
+              <w:pStyle w:val="Compact"/>
+              <w:jc w:val="left"/>
+            </w:pPr>
+            <w:r>
+              <w:t xml:space="preserve">22/22 tests re-run after these changes</w:t>
+            </w:r>
+          </w:p>
+        </w:tc>
+        <w:tc>
+          <w:tcPr/>
+          <w:p>
+            <w:pPr>
+              <w:pStyle w:val="Compact"/>
+              <w:jc w:val="left"/>
+            </w:pPr>
+            <w:r>
+              <w:t xml:space="preserve">✅</w:t>
+            </w:r>
+          </w:p>
+        </w:tc>
+      </w:tr>
     </w:tbl>
     <w:bookmarkEnd w:id="112"/>
     <w:bookmarkStart w:id="113" w:name="Xb7b22857b2d9db123347e01a3e326f882bb258a"/>
@@ -21864,6 +22225,445 @@
       </w:r>
       <w:r>
         <w:t xml:space="preserve">.</w:t>
+      </w:r>
+    </w:p>
+    <w:p>
+      <w:pPr>
+        <w:numPr>
+          <w:ilvl w:val="0"/>
+          <w:numId w:val="1026"/>
+        </w:numPr>
+        <w:pStyle w:val="Compact"/>
+      </w:pPr>
+      <w:r>
+        <w:rPr>
+          <w:bCs/>
+          <w:b/>
+        </w:rPr>
+        <w:t xml:space="preserve">Confirmation messages were off-screen.</w:t>
+      </w:r>
+    </w:p>
+    <w:p>
+      <w:pPr>
+        <w:numPr>
+          <w:ilvl w:val="1"/>
+          <w:numId w:val="1029"/>
+        </w:numPr>
+        <w:pStyle w:val="Compact"/>
+      </w:pPr>
+      <w:r>
+        <w:rPr>
+          <w:iCs/>
+          <w:i/>
+        </w:rPr>
+        <w:t xml:space="preserve">Problem:</w:t>
+      </w:r>
+      <w:r>
+        <w:t xml:space="preserve"> </w:t>
+      </w:r>
+      <w:r>
+        <w:t xml:space="preserve">after Mark as Investigating or Resolve, the confirmation message wasn’t visible.</w:t>
+      </w:r>
+    </w:p>
+    <w:p>
+      <w:pPr>
+        <w:numPr>
+          <w:ilvl w:val="1"/>
+          <w:numId w:val="1029"/>
+        </w:numPr>
+        <w:pStyle w:val="Compact"/>
+      </w:pPr>
+      <w:r>
+        <w:rPr>
+          <w:iCs/>
+          <w:i/>
+        </w:rPr>
+        <w:t xml:space="preserve">Cause:</w:t>
+      </w:r>
+      <w:r>
+        <w:t xml:space="preserve"> </w:t>
+      </w:r>
+      <w:r>
+        <w:t xml:space="preserve">those buttons redirect back to</w:t>
+      </w:r>
+      <w:r>
+        <w:t xml:space="preserve"> </w:t>
+      </w:r>
+      <w:r>
+        <w:rPr>
+          <w:rStyle w:val="VerbatimChar"/>
+        </w:rPr>
+        <w:t xml:space="preserve">/#incidents</w:t>
+      </w:r>
+      <w:r>
+        <w:t xml:space="preserve">, so the browser scrolls down to the incident table, while the message was printed at the</w:t>
+      </w:r>
+      <w:r>
+        <w:t xml:space="preserve"> </w:t>
+      </w:r>
+      <w:r>
+        <w:rPr>
+          <w:bCs/>
+          <w:b/>
+        </w:rPr>
+        <w:t xml:space="preserve">top</w:t>
+      </w:r>
+      <w:r>
+        <w:t xml:space="preserve"> </w:t>
+      </w:r>
+      <w:r>
+        <w:t xml:space="preserve">of the page.</w:t>
+      </w:r>
+    </w:p>
+    <w:p>
+      <w:pPr>
+        <w:numPr>
+          <w:ilvl w:val="1"/>
+          <w:numId w:val="1029"/>
+        </w:numPr>
+        <w:pStyle w:val="Compact"/>
+      </w:pPr>
+      <w:r>
+        <w:rPr>
+          <w:iCs/>
+          <w:i/>
+        </w:rPr>
+        <w:t xml:space="preserve">Fix:</w:t>
+      </w:r>
+      <w:r>
+        <w:t xml:space="preserve"> </w:t>
+      </w:r>
+      <w:r>
+        <w:t xml:space="preserve">messages now render in a</w:t>
+      </w:r>
+      <w:r>
+        <w:t xml:space="preserve"> </w:t>
+      </w:r>
+      <w:r>
+        <w:rPr>
+          <w:rStyle w:val="VerbatimChar"/>
+        </w:rPr>
+        <w:t xml:space="preserve">.message-stack</w:t>
+      </w:r>
+      <w:r>
+        <w:t xml:space="preserve"> </w:t>
+      </w:r>
+      <w:r>
+        <w:t xml:space="preserve">container fixed to the</w:t>
+      </w:r>
+      <w:r>
+        <w:t xml:space="preserve"> </w:t>
+      </w:r>
+      <w:r>
+        <w:rPr>
+          <w:bCs/>
+          <w:b/>
+        </w:rPr>
+        <w:t xml:space="preserve">bottom-left</w:t>
+      </w:r>
+      <w:r>
+        <w:t xml:space="preserve"> </w:t>
+      </w:r>
+      <w:r>
+        <w:t xml:space="preserve">of the screen (CSS</w:t>
+      </w:r>
+      <w:r>
+        <w:t xml:space="preserve"> </w:t>
+      </w:r>
+      <w:r>
+        <w:rPr>
+          <w:rStyle w:val="VerbatimChar"/>
+        </w:rPr>
+        <w:t xml:space="preserve">position: fixed</w:t>
+      </w:r>
+      <w:r>
+        <w:t xml:space="preserve">), with a 12-second auto-close script in</w:t>
+      </w:r>
+      <w:r>
+        <w:t xml:space="preserve"> </w:t>
+      </w:r>
+      <w:r>
+        <w:rPr>
+          <w:rStyle w:val="VerbatimChar"/>
+        </w:rPr>
+        <w:t xml:space="preserve">base.html</w:t>
+      </w:r>
+      <w:r>
+        <w:t xml:space="preserve">.</w:t>
+      </w:r>
+    </w:p>
+    <w:p>
+      <w:pPr>
+        <w:numPr>
+          <w:ilvl w:val="1"/>
+          <w:numId w:val="1029"/>
+        </w:numPr>
+        <w:pStyle w:val="Compact"/>
+      </w:pPr>
+      <w:r>
+        <w:rPr>
+          <w:iCs/>
+          <w:i/>
+        </w:rPr>
+        <w:t xml:space="preserve">Result:</w:t>
+      </w:r>
+      <w:r>
+        <w:t xml:space="preserve"> </w:t>
+      </w:r>
+      <w:r>
+        <w:t xml:space="preserve">every action’s message is visible wherever the page is scrolled.</w:t>
+      </w:r>
+    </w:p>
+    <w:p>
+      <w:pPr>
+        <w:numPr>
+          <w:ilvl w:val="0"/>
+          <w:numId w:val="1026"/>
+        </w:numPr>
+        <w:pStyle w:val="Compact"/>
+      </w:pPr>
+      <w:r>
+        <w:rPr>
+          <w:bCs/>
+          <w:b/>
+        </w:rPr>
+        <w:t xml:space="preserve">The app needed internet for its styling and charts.</w:t>
+      </w:r>
+    </w:p>
+    <w:p>
+      <w:pPr>
+        <w:numPr>
+          <w:ilvl w:val="1"/>
+          <w:numId w:val="1030"/>
+        </w:numPr>
+        <w:pStyle w:val="Compact"/>
+      </w:pPr>
+      <w:r>
+        <w:rPr>
+          <w:iCs/>
+          <w:i/>
+        </w:rPr>
+        <w:t xml:space="preserve">Problem:</w:t>
+      </w:r>
+      <w:r>
+        <w:t xml:space="preserve"> </w:t>
+      </w:r>
+      <w:r>
+        <w:t xml:space="preserve">Bootstrap, Bootstrap Icons, Chart.js and Google Fonts were loaded from CDNs, so with no internet the dashboard would lose its styling and charts.</w:t>
+      </w:r>
+    </w:p>
+    <w:p>
+      <w:pPr>
+        <w:numPr>
+          <w:ilvl w:val="1"/>
+          <w:numId w:val="1030"/>
+        </w:numPr>
+        <w:pStyle w:val="Compact"/>
+      </w:pPr>
+      <w:r>
+        <w:rPr>
+          <w:iCs/>
+          <w:i/>
+        </w:rPr>
+        <w:t xml:space="preserve">Cause:</w:t>
+      </w:r>
+      <w:r>
+        <w:t xml:space="preserve"> </w:t>
+      </w:r>
+      <w:r>
+        <w:t xml:space="preserve">external</w:t>
+      </w:r>
+      <w:r>
+        <w:t xml:space="preserve"> </w:t>
+      </w:r>
+      <w:r>
+        <w:rPr>
+          <w:rStyle w:val="VerbatimChar"/>
+        </w:rPr>
+        <w:t xml:space="preserve">&lt;link&gt;</w:t>
+      </w:r>
+      <w:r>
+        <w:t xml:space="preserve"> </w:t>
+      </w:r>
+      <w:r>
+        <w:t xml:space="preserve">and</w:t>
+      </w:r>
+      <w:r>
+        <w:t xml:space="preserve"> </w:t>
+      </w:r>
+      <w:r>
+        <w:rPr>
+          <w:rStyle w:val="VerbatimChar"/>
+        </w:rPr>
+        <w:t xml:space="preserve">&lt;script&gt;</w:t>
+      </w:r>
+      <w:r>
+        <w:t xml:space="preserve"> </w:t>
+      </w:r>
+      <w:r>
+        <w:t xml:space="preserve">URLs in</w:t>
+      </w:r>
+      <w:r>
+        <w:t xml:space="preserve"> </w:t>
+      </w:r>
+      <w:r>
+        <w:rPr>
+          <w:rStyle w:val="VerbatimChar"/>
+        </w:rPr>
+        <w:t xml:space="preserve">base.html</w:t>
+      </w:r>
+      <w:r>
+        <w:t xml:space="preserve"> </w:t>
+      </w:r>
+      <w:r>
+        <w:t xml:space="preserve">and</w:t>
+      </w:r>
+      <w:r>
+        <w:t xml:space="preserve"> </w:t>
+      </w:r>
+      <w:r>
+        <w:rPr>
+          <w:rStyle w:val="VerbatimChar"/>
+        </w:rPr>
+        <w:t xml:space="preserve">dashboard.html</w:t>
+      </w:r>
+      <w:r>
+        <w:t xml:space="preserve">.</w:t>
+      </w:r>
+    </w:p>
+    <w:p>
+      <w:pPr>
+        <w:numPr>
+          <w:ilvl w:val="1"/>
+          <w:numId w:val="1030"/>
+        </w:numPr>
+        <w:pStyle w:val="Compact"/>
+      </w:pPr>
+      <w:r>
+        <w:rPr>
+          <w:iCs/>
+          <w:i/>
+        </w:rPr>
+        <w:t xml:space="preserve">Fix:</w:t>
+      </w:r>
+      <w:r>
+        <w:t xml:space="preserve"> </w:t>
+      </w:r>
+      <w:r>
+        <w:t xml:space="preserve">downloaded the exact versions (Bootstrap 5.3.3, Bootstrap Icons 1.11.3, Chart.js 4.4.4, Inter and JetBrains Mono from Fontsource) into</w:t>
+      </w:r>
+      <w:r>
+        <w:t xml:space="preserve"> </w:t>
+      </w:r>
+      <w:r>
+        <w:rPr>
+          <w:rStyle w:val="VerbatimChar"/>
+        </w:rPr>
+        <w:t xml:space="preserve">static/vendor/</w:t>
+      </w:r>
+      <w:r>
+        <w:t xml:space="preserve"> </w:t>
+      </w:r>
+      <w:r>
+        <w:t xml:space="preserve">on the laptop. Added</w:t>
+      </w:r>
+      <w:r>
+        <w:t xml:space="preserve"> </w:t>
+      </w:r>
+      <w:r>
+        <w:rPr>
+          <w:rStyle w:val="VerbatimChar"/>
+        </w:rPr>
+        <w:t xml:space="preserve">static/css/fonts.css</w:t>
+      </w:r>
+      <w:r>
+        <w:t xml:space="preserve"> </w:t>
+      </w:r>
+      <w:r>
+        <w:t xml:space="preserve">with</w:t>
+      </w:r>
+      <w:r>
+        <w:t xml:space="preserve"> </w:t>
+      </w:r>
+      <w:r>
+        <w:rPr>
+          <w:rStyle w:val="VerbatimChar"/>
+        </w:rPr>
+        <w:t xml:space="preserve">@font-face</w:t>
+      </w:r>
+      <w:r>
+        <w:t xml:space="preserve"> </w:t>
+      </w:r>
+      <w:r>
+        <w:t xml:space="preserve">rules, switched the templates to</w:t>
+      </w:r>
+      <w:r>
+        <w:t xml:space="preserve"> </w:t>
+      </w:r>
+      <w:r>
+        <w:rPr>
+          <w:rStyle w:val="VerbatimChar"/>
+        </w:rPr>
+        <w:t xml:space="preserve">{% static %}</w:t>
+      </w:r>
+      <w:r>
+        <w:t xml:space="preserve"> </w:t>
+      </w:r>
+      <w:r>
+        <w:t xml:space="preserve">paths, and removed the source-map comments (which would cause harmless 404s in the browser’s developer tools).</w:t>
+      </w:r>
+    </w:p>
+    <w:p>
+      <w:pPr>
+        <w:numPr>
+          <w:ilvl w:val="1"/>
+          <w:numId w:val="1030"/>
+        </w:numPr>
+        <w:pStyle w:val="Compact"/>
+      </w:pPr>
+      <w:r>
+        <w:rPr>
+          <w:iCs/>
+          <w:i/>
+        </w:rPr>
+        <w:t xml:space="preserve">Result:</w:t>
+      </w:r>
+      <w:r>
+        <w:t xml:space="preserve"> </w:t>
+      </w:r>
+      <w:r>
+        <w:t xml:space="preserve">the browser’s network log shows every request going to</w:t>
+      </w:r>
+      <w:r>
+        <w:t xml:space="preserve"> </w:t>
+      </w:r>
+      <w:r>
+        <w:rPr>
+          <w:rStyle w:val="VerbatimChar"/>
+        </w:rPr>
+        <w:t xml:space="preserve">127.0.0.1</w:t>
+      </w:r>
+      <w:r>
+        <w:t xml:space="preserve"> </w:t>
+      </w:r>
+      <w:r>
+        <w:t xml:space="preserve">and</w:t>
+      </w:r>
+      <w:r>
+        <w:t xml:space="preserve"> </w:t>
+      </w:r>
+      <w:r>
+        <w:rPr>
+          <w:bCs/>
+          <w:b/>
+        </w:rPr>
+        <w:t xml:space="preserve">zero</w:t>
+      </w:r>
+      <w:r>
+        <w:t xml:space="preserve"> </w:t>
+      </w:r>
+      <w:r>
+        <w:t xml:space="preserve">external requests.</w:t>
       </w:r>
     </w:p>
     <w:p>
@@ -22308,7 +23108,7 @@
       <w:pPr>
         <w:numPr>
           <w:ilvl w:val="0"/>
-          <w:numId w:val="1029"/>
+          <w:numId w:val="1031"/>
         </w:numPr>
         <w:pStyle w:val="Compact"/>
       </w:pPr>
@@ -22361,481 +23161,6 @@
       </w:r>
       <w:r>
         <w:t xml:space="preserve">). Like the columns of a spreadsheet.</w:t>
-      </w:r>
-    </w:p>
-    <w:p>
-      <w:pPr>
-        <w:numPr>
-          <w:ilvl w:val="0"/>
-          <w:numId w:val="1029"/>
-        </w:numPr>
-        <w:pStyle w:val="Compact"/>
-      </w:pPr>
-      <w:r>
-        <w:rPr>
-          <w:bCs/>
-          <w:b/>
-        </w:rPr>
-        <w:t xml:space="preserve">View</w:t>
-      </w:r>
-      <w:r>
-        <w:t xml:space="preserve"> </w:t>
-      </w:r>
-      <w:r>
-        <w:t xml:space="preserve">=</w:t>
-      </w:r>
-      <w:r>
-        <w:t xml:space="preserve"> </w:t>
-      </w:r>
-      <w:r>
-        <w:rPr>
-          <w:iCs/>
-          <w:i/>
-        </w:rPr>
-        <w:t xml:space="preserve">the worker</w:t>
-      </w:r>
-      <w:r>
-        <w:t xml:space="preserve"> </w:t>
-      </w:r>
-      <w:r>
-        <w:t xml:space="preserve">that gets a request, fetches or changes data, and chooses what to show. Like a waiter taking an order.</w:t>
-      </w:r>
-    </w:p>
-    <w:p>
-      <w:pPr>
-        <w:numPr>
-          <w:ilvl w:val="0"/>
-          <w:numId w:val="1029"/>
-        </w:numPr>
-        <w:pStyle w:val="Compact"/>
-      </w:pPr>
-      <w:r>
-        <w:rPr>
-          <w:bCs/>
-          <w:b/>
-        </w:rPr>
-        <w:t xml:space="preserve">Template</w:t>
-      </w:r>
-      <w:r>
-        <w:t xml:space="preserve"> </w:t>
-      </w:r>
-      <w:r>
-        <w:t xml:space="preserve">=</w:t>
-      </w:r>
-      <w:r>
-        <w:t xml:space="preserve"> </w:t>
-      </w:r>
-      <w:r>
-        <w:rPr>
-          <w:iCs/>
-          <w:i/>
-        </w:rPr>
-        <w:t xml:space="preserve">the presentation</w:t>
-      </w:r>
-      <w:r>
-        <w:t xml:space="preserve">: HTML with placeholders that get filled in. Like the plate the food is served on.</w:t>
-      </w:r>
-    </w:p>
-    <w:p>
-      <w:pPr>
-        <w:pStyle w:val="FirstParagraph"/>
-      </w:pPr>
-      <w:r>
-        <w:t xml:space="preserve">(Django’s</w:t>
-      </w:r>
-      <w:r>
-        <w:t xml:space="preserve"> </w:t>
-      </w:r>
-      <w:r>
-        <w:t xml:space="preserve">“</w:t>
-      </w:r>
-      <w:r>
-        <w:t xml:space="preserve">View</w:t>
-      </w:r>
-      <w:r>
-        <w:t xml:space="preserve">”</w:t>
-      </w:r>
-      <w:r>
-        <w:t xml:space="preserve"> </w:t>
-      </w:r>
-      <w:r>
-        <w:t xml:space="preserve">plays the role of the</w:t>
-      </w:r>
-      <w:r>
-        <w:t xml:space="preserve"> </w:t>
-      </w:r>
-      <w:r>
-        <w:t xml:space="preserve">“</w:t>
-      </w:r>
-      <w:r>
-        <w:t xml:space="preserve">Controller</w:t>
-      </w:r>
-      <w:r>
-        <w:t xml:space="preserve">”</w:t>
-      </w:r>
-      <w:r>
-        <w:t xml:space="preserve"> </w:t>
-      </w:r>
-      <w:r>
-        <w:t xml:space="preserve">in classic MVC; Django’s</w:t>
-      </w:r>
-      <w:r>
-        <w:t xml:space="preserve"> </w:t>
-      </w:r>
-      <w:r>
-        <w:t xml:space="preserve">“</w:t>
-      </w:r>
-      <w:r>
-        <w:t xml:space="preserve">Template</w:t>
-      </w:r>
-      <w:r>
-        <w:t xml:space="preserve">”</w:t>
-      </w:r>
-      <w:r>
-        <w:t xml:space="preserve"> </w:t>
-      </w:r>
-      <w:r>
-        <w:t xml:space="preserve">is MVC’s</w:t>
-      </w:r>
-      <w:r>
-        <w:t xml:space="preserve"> </w:t>
-      </w:r>
-      <w:r>
-        <w:t xml:space="preserve">“</w:t>
-      </w:r>
-      <w:r>
-        <w:t xml:space="preserve">View</w:t>
-      </w:r>
-      <w:r>
-        <w:t xml:space="preserve">”</w:t>
-      </w:r>
-      <w:r>
-        <w:t xml:space="preserve">.) NetOps adds a</w:t>
-      </w:r>
-      <w:r>
-        <w:t xml:space="preserve"> </w:t>
-      </w:r>
-      <w:r>
-        <w:rPr>
-          <w:bCs/>
-          <w:b/>
-        </w:rPr>
-        <w:t xml:space="preserve">service layer</w:t>
-      </w:r>
-      <w:r>
-        <w:t xml:space="preserve"> </w:t>
-      </w:r>
-      <w:r>
-        <w:t xml:space="preserve">between views and models for the business rules.</w:t>
-      </w:r>
-    </w:p>
-    <w:p>
-      <w:r>
-        <w:pict>
-          <v:rect style="width:0;height:1.5pt" o:hralign="center" o:hrstd="t" o:hr="t"/>
-        </w:pict>
-      </w:r>
-    </w:p>
-    <w:bookmarkEnd w:id="115"/>
-    <w:bookmarkEnd w:id="116"/>
-    <w:bookmarkStart w:id="117" w:name="phase-20-complete-netops-workflow"/>
-    <w:p>
-      <w:pPr>
-        <w:pStyle w:val="Heading2"/>
-      </w:pPr>
-      <w:r>
-        <w:t xml:space="preserve">Phase 20 — Complete NetOps Workflow</w:t>
-      </w:r>
-    </w:p>
-    <w:p>
-      <w:pPr>
-        <w:pStyle w:val="SourceCode"/>
-      </w:pPr>
-      <w:r>
-        <w:rPr>
-          <w:rStyle w:val="VerbatimChar"/>
-        </w:rPr>
-        <w:t xml:space="preserve">Infrastructure Asset           (row in SQLite, e.g. Customer Database)</w:t>
-      </w:r>
-      <w:r>
-        <w:br/>
-      </w:r>
-      <w:r>
-        <w:rPr>
-          <w:rStyle w:val="VerbatimChar"/>
-        </w:rPr>
-        <w:t xml:space="preserve">        ↓</w:t>
-      </w:r>
-      <w:r>
-        <w:br/>
-      </w:r>
-      <w:r>
-        <w:rPr>
-          <w:rStyle w:val="VerbatimChar"/>
-        </w:rPr>
-        <w:t xml:space="preserve">Metrics                        (CPU 93.7%, memory 62%, latency 37 ms; simulated)</w:t>
-      </w:r>
-      <w:r>
-        <w:br/>
-      </w:r>
-      <w:r>
-        <w:rPr>
-          <w:rStyle w:val="VerbatimChar"/>
-        </w:rPr>
-        <w:t xml:space="preserve">        ↓</w:t>
-      </w:r>
-      <w:r>
-        <w:br/>
-      </w:r>
-      <w:r>
-        <w:rPr>
-          <w:rStyle w:val="VerbatimChar"/>
-        </w:rPr>
-        <w:t xml:space="preserve">Monitoring Engine              run_monitoring_check()</w:t>
-      </w:r>
-      <w:r>
-        <w:br/>
-      </w:r>
-      <w:r>
-        <w:rPr>
-          <w:rStyle w:val="VerbatimChar"/>
-        </w:rPr>
-        <w:t xml:space="preserve">        ↓</w:t>
-      </w:r>
-      <w:r>
-        <w:br/>
-      </w:r>
-      <w:r>
-        <w:rPr>
-          <w:rStyle w:val="VerbatimChar"/>
-        </w:rPr>
-        <w:t xml:space="preserve">Threshold Evaluation           classify_metric(): 93.7 &gt; 85 → CRITICAL</w:t>
-      </w:r>
-      <w:r>
-        <w:br/>
-      </w:r>
-      <w:r>
-        <w:rPr>
-          <w:rStyle w:val="VerbatimChar"/>
-        </w:rPr>
-        <w:t xml:space="preserve">        ↓</w:t>
-      </w:r>
-      <w:r>
-        <w:br/>
-      </w:r>
-      <w:r>
-        <w:rPr>
-          <w:rStyle w:val="VerbatimChar"/>
-        </w:rPr>
-        <w:t xml:space="preserve">Healthy / Warning / Critical / Offline   worst_status() → asset.status = CRITICAL</w:t>
-      </w:r>
-      <w:r>
-        <w:br/>
-      </w:r>
-      <w:r>
-        <w:rPr>
-          <w:rStyle w:val="VerbatimChar"/>
-        </w:rPr>
-        <w:t xml:space="preserve">        ↓</w:t>
-      </w:r>
-      <w:r>
-        <w:br/>
-      </w:r>
-      <w:r>
-        <w:rPr>
-          <w:rStyle w:val="VerbatimChar"/>
-        </w:rPr>
-        <w:t xml:space="preserve">Incident                       create_incident_if_needed() → INC-0004 "High CPU Utilisation"</w:t>
-      </w:r>
-      <w:r>
-        <w:br/>
-      </w:r>
-      <w:r>
-        <w:rPr>
-          <w:rStyle w:val="VerbatimChar"/>
-        </w:rPr>
-        <w:t xml:space="preserve">        ↓                      (+ severity Critical + rule-based recommendation)</w:t>
-      </w:r>
-      <w:r>
-        <w:br/>
-      </w:r>
-      <w:r>
-        <w:rPr>
-          <w:rStyle w:val="VerbatimChar"/>
-        </w:rPr>
-        <w:t xml:space="preserve">Open                           visible in Active Incidents</w:t>
-      </w:r>
-      <w:r>
-        <w:br/>
-      </w:r>
-      <w:r>
-        <w:rPr>
-          <w:rStyle w:val="VerbatimChar"/>
-        </w:rPr>
-        <w:t xml:space="preserve">        ↓   engineer clicks Mark as Investigating</w:t>
-      </w:r>
-      <w:r>
-        <w:br/>
-      </w:r>
-      <w:r>
-        <w:rPr>
-          <w:rStyle w:val="VerbatimChar"/>
-        </w:rPr>
-        <w:t xml:space="preserve">Investigating                  still active, owner is working on it</w:t>
-      </w:r>
-      <w:r>
-        <w:br/>
-      </w:r>
-      <w:r>
-        <w:rPr>
-          <w:rStyle w:val="VerbatimChar"/>
-        </w:rPr>
-        <w:t xml:space="preserve">        ↓   engineer clicks Resolve</w:t>
-      </w:r>
-      <w:r>
-        <w:br/>
-      </w:r>
-      <w:r>
-        <w:rPr>
-          <w:rStyle w:val="VerbatimChar"/>
-        </w:rPr>
-        <w:t xml:space="preserve">Resolved                       resolved_at stored; moved to Recently Resolved</w:t>
-      </w:r>
-    </w:p>
-    <w:p>
-      <w:pPr>
-        <w:pStyle w:val="FirstParagraph"/>
-      </w:pPr>
-      <w:r>
-        <w:t xml:space="preserve">Every arrow is real code, and every state is saved in SQLite.</w:t>
-      </w:r>
-    </w:p>
-    <w:p>
-      <w:r>
-        <w:pict>
-          <v:rect style="width:0;height:1.5pt" o:hralign="center" o:hrstd="t" o:hr="t"/>
-        </w:pict>
-      </w:r>
-    </w:p>
-    <w:bookmarkEnd w:id="117"/>
-    <w:bookmarkStart w:id="122" w:name="Xc4eedcce6898083c9fd210e5e9ad6f06222c600"/>
-    <w:p>
-      <w:pPr>
-        <w:pStyle w:val="Heading2"/>
-      </w:pPr>
-      <w:r>
-        <w:t xml:space="preserve">Phase 21 — Running the Finished Project (from a cold start)</w:t>
-      </w:r>
-    </w:p>
-    <w:bookmarkStart w:id="118" w:name="easiest-way"/>
-    <w:p>
-      <w:pPr>
-        <w:pStyle w:val="Heading3"/>
-      </w:pPr>
-      <w:r>
-        <w:t xml:space="preserve">Easiest way</w:t>
-      </w:r>
-    </w:p>
-    <w:p>
-      <w:pPr>
-        <w:numPr>
-          <w:ilvl w:val="0"/>
-          <w:numId w:val="1030"/>
-        </w:numPr>
-        <w:pStyle w:val="Compact"/>
-      </w:pPr>
-      <w:r>
-        <w:t xml:space="preserve">Open File Explorer →</w:t>
-      </w:r>
-      <w:r>
-        <w:t xml:space="preserve"> </w:t>
-      </w:r>
-      <w:r>
-        <w:rPr>
-          <w:bCs/>
-          <w:b/>
-        </w:rPr>
-        <w:t xml:space="preserve">Documents</w:t>
-      </w:r>
-      <w:r>
-        <w:t xml:space="preserve"> </w:t>
-      </w:r>
-      <w:r>
-        <w:t xml:space="preserve">→</w:t>
-      </w:r>
-      <w:r>
-        <w:t xml:space="preserve"> </w:t>
-      </w:r>
-      <w:r>
-        <w:rPr>
-          <w:bCs/>
-          <w:b/>
-        </w:rPr>
-        <w:t xml:space="preserve">NetOps — Network &amp; Infrastructure Monitoring Dashboard</w:t>
-      </w:r>
-      <w:r>
-        <w:t xml:space="preserve">.</w:t>
-      </w:r>
-    </w:p>
-    <w:p>
-      <w:pPr>
-        <w:numPr>
-          <w:ilvl w:val="0"/>
-          <w:numId w:val="1030"/>
-        </w:numPr>
-        <w:pStyle w:val="Compact"/>
-      </w:pPr>
-      <w:r>
-        <w:t xml:space="preserve">Double-click</w:t>
-      </w:r>
-      <w:r>
-        <w:t xml:space="preserve"> </w:t>
-      </w:r>
-      <w:r>
-        <w:rPr>
-          <w:rStyle w:val="VerbatimChar"/>
-          <w:bCs/>
-          <w:b/>
-        </w:rPr>
-        <w:t xml:space="preserve">start_netops.bat</w:t>
-      </w:r>
-      <w:r>
-        <w:t xml:space="preserve">. A black window opens (that’s the server) and your browser opens NetOps after about 3 seconds.</w:t>
-      </w:r>
-    </w:p>
-    <w:p>
-      <w:pPr>
-        <w:numPr>
-          <w:ilvl w:val="0"/>
-          <w:numId w:val="1030"/>
-        </w:numPr>
-        <w:pStyle w:val="Compact"/>
-      </w:pPr>
-      <w:r>
-        <w:t xml:space="preserve">To stop: click the black window and press</w:t>
-      </w:r>
-      <w:r>
-        <w:t xml:space="preserve"> </w:t>
-      </w:r>
-      <w:r>
-        <w:rPr>
-          <w:bCs/>
-          <w:b/>
-        </w:rPr>
-        <w:t xml:space="preserve">CTRL + C</w:t>
-      </w:r>
-      <w:r>
-        <w:t xml:space="preserve">, then close it.</w:t>
-      </w:r>
-    </w:p>
-    <w:bookmarkEnd w:id="118"/>
-    <w:bookmarkStart w:id="119" w:name="manual-way-vs-code-or-powershell"/>
-    <w:p>
-      <w:pPr>
-        <w:pStyle w:val="Heading3"/>
-      </w:pPr>
-      <w:r>
-        <w:t xml:space="preserve">Manual way (VS Code or PowerShell)</w:t>
       </w:r>
     </w:p>
     <w:p>
@@ -22844,19 +23169,20 @@
           <w:ilvl w:val="0"/>
           <w:numId w:val="1031"/>
         </w:numPr>
+        <w:pStyle w:val="Compact"/>
       </w:pPr>
       <w:r>
         <w:rPr>
           <w:bCs/>
           <w:b/>
         </w:rPr>
-        <w:t xml:space="preserve">Open a terminal:</w:t>
-      </w:r>
-      <w:r>
-        <w:t xml:space="preserve"> </w:t>
-      </w:r>
-      <w:r>
-        <w:t xml:space="preserve">in VS Code,</w:t>
+        <w:t xml:space="preserve">View</w:t>
+      </w:r>
+      <w:r>
+        <w:t xml:space="preserve"> </w:t>
+      </w:r>
+      <w:r>
+        <w:t xml:space="preserve">=</w:t>
       </w:r>
       <w:r>
         <w:t xml:space="preserve"> </w:t>
@@ -22866,26 +23192,13 @@
           <w:iCs/>
           <w:i/>
         </w:rPr>
-        <w:t xml:space="preserve">File → Open Folder</w:t>
-      </w:r>
-      <w:r>
-        <w:t xml:space="preserve"> </w:t>
-      </w:r>
-      <w:r>
-        <w:t xml:space="preserve">→ the NetOps folder, then</w:t>
-      </w:r>
-      <w:r>
-        <w:t xml:space="preserve"> </w:t>
-      </w:r>
-      <w:r>
-        <w:rPr>
-          <w:iCs/>
-          <w:i/>
-        </w:rPr>
-        <w:t xml:space="preserve">Terminal → New Terminal</w:t>
-      </w:r>
-      <w:r>
-        <w:t xml:space="preserve">. Or open PowerShell from the Start menu.</w:t>
+        <w:t xml:space="preserve">the worker</w:t>
+      </w:r>
+      <w:r>
+        <w:t xml:space="preserve"> </w:t>
+      </w:r>
+      <w:r>
+        <w:t xml:space="preserve">that gets a request, fetches or changes data, and chooses what to show. Like a waiter taking an order.</w:t>
       </w:r>
     </w:p>
     <w:p>
@@ -22893,6 +23206,493 @@
         <w:numPr>
           <w:ilvl w:val="0"/>
           <w:numId w:val="1031"/>
+        </w:numPr>
+        <w:pStyle w:val="Compact"/>
+      </w:pPr>
+      <w:r>
+        <w:rPr>
+          <w:bCs/>
+          <w:b/>
+        </w:rPr>
+        <w:t xml:space="preserve">Template</w:t>
+      </w:r>
+      <w:r>
+        <w:t xml:space="preserve"> </w:t>
+      </w:r>
+      <w:r>
+        <w:t xml:space="preserve">=</w:t>
+      </w:r>
+      <w:r>
+        <w:t xml:space="preserve"> </w:t>
+      </w:r>
+      <w:r>
+        <w:rPr>
+          <w:iCs/>
+          <w:i/>
+        </w:rPr>
+        <w:t xml:space="preserve">the presentation</w:t>
+      </w:r>
+      <w:r>
+        <w:t xml:space="preserve">: HTML with placeholders that get filled in. Like the plate the food is served on.</w:t>
+      </w:r>
+    </w:p>
+    <w:p>
+      <w:pPr>
+        <w:pStyle w:val="FirstParagraph"/>
+      </w:pPr>
+      <w:r>
+        <w:t xml:space="preserve">(Django’s</w:t>
+      </w:r>
+      <w:r>
+        <w:t xml:space="preserve"> </w:t>
+      </w:r>
+      <w:r>
+        <w:t xml:space="preserve">“</w:t>
+      </w:r>
+      <w:r>
+        <w:t xml:space="preserve">View</w:t>
+      </w:r>
+      <w:r>
+        <w:t xml:space="preserve">”</w:t>
+      </w:r>
+      <w:r>
+        <w:t xml:space="preserve"> </w:t>
+      </w:r>
+      <w:r>
+        <w:t xml:space="preserve">plays the role of the</w:t>
+      </w:r>
+      <w:r>
+        <w:t xml:space="preserve"> </w:t>
+      </w:r>
+      <w:r>
+        <w:t xml:space="preserve">“</w:t>
+      </w:r>
+      <w:r>
+        <w:t xml:space="preserve">Controller</w:t>
+      </w:r>
+      <w:r>
+        <w:t xml:space="preserve">”</w:t>
+      </w:r>
+      <w:r>
+        <w:t xml:space="preserve"> </w:t>
+      </w:r>
+      <w:r>
+        <w:t xml:space="preserve">in classic MVC; Django’s</w:t>
+      </w:r>
+      <w:r>
+        <w:t xml:space="preserve"> </w:t>
+      </w:r>
+      <w:r>
+        <w:t xml:space="preserve">“</w:t>
+      </w:r>
+      <w:r>
+        <w:t xml:space="preserve">Template</w:t>
+      </w:r>
+      <w:r>
+        <w:t xml:space="preserve">”</w:t>
+      </w:r>
+      <w:r>
+        <w:t xml:space="preserve"> </w:t>
+      </w:r>
+      <w:r>
+        <w:t xml:space="preserve">is MVC’s</w:t>
+      </w:r>
+      <w:r>
+        <w:t xml:space="preserve"> </w:t>
+      </w:r>
+      <w:r>
+        <w:t xml:space="preserve">“</w:t>
+      </w:r>
+      <w:r>
+        <w:t xml:space="preserve">View</w:t>
+      </w:r>
+      <w:r>
+        <w:t xml:space="preserve">”</w:t>
+      </w:r>
+      <w:r>
+        <w:t xml:space="preserve">.) NetOps adds a</w:t>
+      </w:r>
+      <w:r>
+        <w:t xml:space="preserve"> </w:t>
+      </w:r>
+      <w:r>
+        <w:rPr>
+          <w:bCs/>
+          <w:b/>
+        </w:rPr>
+        <w:t xml:space="preserve">service layer</w:t>
+      </w:r>
+      <w:r>
+        <w:t xml:space="preserve"> </w:t>
+      </w:r>
+      <w:r>
+        <w:t xml:space="preserve">between views and models for the business rules.</w:t>
+      </w:r>
+    </w:p>
+    <w:p>
+      <w:r>
+        <w:pict>
+          <v:rect style="width:0;height:1.5pt" o:hralign="center" o:hrstd="t" o:hr="t"/>
+        </w:pict>
+      </w:r>
+    </w:p>
+    <w:bookmarkEnd w:id="115"/>
+    <w:bookmarkEnd w:id="116"/>
+    <w:bookmarkStart w:id="117" w:name="phase-20-complete-netops-workflow"/>
+    <w:p>
+      <w:pPr>
+        <w:pStyle w:val="Heading2"/>
+      </w:pPr>
+      <w:r>
+        <w:t xml:space="preserve">Phase 20 — Complete NetOps Workflow</w:t>
+      </w:r>
+    </w:p>
+    <w:p>
+      <w:pPr>
+        <w:pStyle w:val="SourceCode"/>
+      </w:pPr>
+      <w:r>
+        <w:rPr>
+          <w:rStyle w:val="VerbatimChar"/>
+        </w:rPr>
+        <w:t xml:space="preserve">Infrastructure Asset           (row in SQLite, e.g. Customer Database)</w:t>
+      </w:r>
+      <w:r>
+        <w:br/>
+      </w:r>
+      <w:r>
+        <w:rPr>
+          <w:rStyle w:val="VerbatimChar"/>
+        </w:rPr>
+        <w:t xml:space="preserve">        ↓</w:t>
+      </w:r>
+      <w:r>
+        <w:br/>
+      </w:r>
+      <w:r>
+        <w:rPr>
+          <w:rStyle w:val="VerbatimChar"/>
+        </w:rPr>
+        <w:t xml:space="preserve">Metrics                        (CPU 93.7%, memory 62%, latency 37 ms; simulated)</w:t>
+      </w:r>
+      <w:r>
+        <w:br/>
+      </w:r>
+      <w:r>
+        <w:rPr>
+          <w:rStyle w:val="VerbatimChar"/>
+        </w:rPr>
+        <w:t xml:space="preserve">        ↓</w:t>
+      </w:r>
+      <w:r>
+        <w:br/>
+      </w:r>
+      <w:r>
+        <w:rPr>
+          <w:rStyle w:val="VerbatimChar"/>
+        </w:rPr>
+        <w:t xml:space="preserve">Monitoring Engine              run_monitoring_check()</w:t>
+      </w:r>
+      <w:r>
+        <w:br/>
+      </w:r>
+      <w:r>
+        <w:rPr>
+          <w:rStyle w:val="VerbatimChar"/>
+        </w:rPr>
+        <w:t xml:space="preserve">        ↓</w:t>
+      </w:r>
+      <w:r>
+        <w:br/>
+      </w:r>
+      <w:r>
+        <w:rPr>
+          <w:rStyle w:val="VerbatimChar"/>
+        </w:rPr>
+        <w:t xml:space="preserve">Threshold Evaluation           classify_metric(): 93.7 &gt; 85 → CRITICAL</w:t>
+      </w:r>
+      <w:r>
+        <w:br/>
+      </w:r>
+      <w:r>
+        <w:rPr>
+          <w:rStyle w:val="VerbatimChar"/>
+        </w:rPr>
+        <w:t xml:space="preserve">        ↓</w:t>
+      </w:r>
+      <w:r>
+        <w:br/>
+      </w:r>
+      <w:r>
+        <w:rPr>
+          <w:rStyle w:val="VerbatimChar"/>
+        </w:rPr>
+        <w:t xml:space="preserve">Healthy / Warning / Critical / Offline   worst_status() → asset.status = CRITICAL</w:t>
+      </w:r>
+      <w:r>
+        <w:br/>
+      </w:r>
+      <w:r>
+        <w:rPr>
+          <w:rStyle w:val="VerbatimChar"/>
+        </w:rPr>
+        <w:t xml:space="preserve">        ↓</w:t>
+      </w:r>
+      <w:r>
+        <w:br/>
+      </w:r>
+      <w:r>
+        <w:rPr>
+          <w:rStyle w:val="VerbatimChar"/>
+        </w:rPr>
+        <w:t xml:space="preserve">Incident                       create_incident_if_needed() → INC-0004 "High CPU Utilisation"</w:t>
+      </w:r>
+      <w:r>
+        <w:br/>
+      </w:r>
+      <w:r>
+        <w:rPr>
+          <w:rStyle w:val="VerbatimChar"/>
+        </w:rPr>
+        <w:t xml:space="preserve">        ↓                      (+ severity Critical + rule-based recommendation)</w:t>
+      </w:r>
+      <w:r>
+        <w:br/>
+      </w:r>
+      <w:r>
+        <w:rPr>
+          <w:rStyle w:val="VerbatimChar"/>
+        </w:rPr>
+        <w:t xml:space="preserve">Open                           visible in Active Incidents</w:t>
+      </w:r>
+      <w:r>
+        <w:br/>
+      </w:r>
+      <w:r>
+        <w:rPr>
+          <w:rStyle w:val="VerbatimChar"/>
+        </w:rPr>
+        <w:t xml:space="preserve">        ↓   engineer clicks Mark as Investigating</w:t>
+      </w:r>
+      <w:r>
+        <w:br/>
+      </w:r>
+      <w:r>
+        <w:rPr>
+          <w:rStyle w:val="VerbatimChar"/>
+        </w:rPr>
+        <w:t xml:space="preserve">Investigating                  still active, owner is working on it</w:t>
+      </w:r>
+      <w:r>
+        <w:br/>
+      </w:r>
+      <w:r>
+        <w:rPr>
+          <w:rStyle w:val="VerbatimChar"/>
+        </w:rPr>
+        <w:t xml:space="preserve">        ↓   engineer clicks Resolve</w:t>
+      </w:r>
+      <w:r>
+        <w:br/>
+      </w:r>
+      <w:r>
+        <w:rPr>
+          <w:rStyle w:val="VerbatimChar"/>
+        </w:rPr>
+        <w:t xml:space="preserve">Resolved                       resolved_at stored; moved to Recently Resolved</w:t>
+      </w:r>
+    </w:p>
+    <w:p>
+      <w:pPr>
+        <w:pStyle w:val="FirstParagraph"/>
+      </w:pPr>
+      <w:r>
+        <w:t xml:space="preserve">Every arrow is real code, and every state is saved in SQLite.</w:t>
+      </w:r>
+    </w:p>
+    <w:p>
+      <w:r>
+        <w:pict>
+          <v:rect style="width:0;height:1.5pt" o:hralign="center" o:hrstd="t" o:hr="t"/>
+        </w:pict>
+      </w:r>
+    </w:p>
+    <w:bookmarkEnd w:id="117"/>
+    <w:bookmarkStart w:id="122" w:name="Xc4eedcce6898083c9fd210e5e9ad6f06222c600"/>
+    <w:p>
+      <w:pPr>
+        <w:pStyle w:val="Heading2"/>
+      </w:pPr>
+      <w:r>
+        <w:t xml:space="preserve">Phase 21 — Running the Finished Project (from a cold start)</w:t>
+      </w:r>
+    </w:p>
+    <w:bookmarkStart w:id="118" w:name="easiest-way"/>
+    <w:p>
+      <w:pPr>
+        <w:pStyle w:val="Heading3"/>
+      </w:pPr>
+      <w:r>
+        <w:t xml:space="preserve">Easiest way</w:t>
+      </w:r>
+    </w:p>
+    <w:p>
+      <w:pPr>
+        <w:numPr>
+          <w:ilvl w:val="0"/>
+          <w:numId w:val="1032"/>
+        </w:numPr>
+        <w:pStyle w:val="Compact"/>
+      </w:pPr>
+      <w:r>
+        <w:t xml:space="preserve">Open File Explorer →</w:t>
+      </w:r>
+      <w:r>
+        <w:t xml:space="preserve"> </w:t>
+      </w:r>
+      <w:r>
+        <w:rPr>
+          <w:bCs/>
+          <w:b/>
+        </w:rPr>
+        <w:t xml:space="preserve">Documents</w:t>
+      </w:r>
+      <w:r>
+        <w:t xml:space="preserve"> </w:t>
+      </w:r>
+      <w:r>
+        <w:t xml:space="preserve">→</w:t>
+      </w:r>
+      <w:r>
+        <w:t xml:space="preserve"> </w:t>
+      </w:r>
+      <w:r>
+        <w:rPr>
+          <w:bCs/>
+          <w:b/>
+        </w:rPr>
+        <w:t xml:space="preserve">NetOps — Network &amp; Infrastructure Monitoring Dashboard</w:t>
+      </w:r>
+      <w:r>
+        <w:t xml:space="preserve">.</w:t>
+      </w:r>
+    </w:p>
+    <w:p>
+      <w:pPr>
+        <w:numPr>
+          <w:ilvl w:val="0"/>
+          <w:numId w:val="1032"/>
+        </w:numPr>
+        <w:pStyle w:val="Compact"/>
+      </w:pPr>
+      <w:r>
+        <w:t xml:space="preserve">Double-click</w:t>
+      </w:r>
+      <w:r>
+        <w:t xml:space="preserve"> </w:t>
+      </w:r>
+      <w:r>
+        <w:rPr>
+          <w:rStyle w:val="VerbatimChar"/>
+          <w:bCs/>
+          <w:b/>
+        </w:rPr>
+        <w:t xml:space="preserve">start_netops.bat</w:t>
+      </w:r>
+      <w:r>
+        <w:t xml:space="preserve">. A black window opens (that’s the server) and your browser opens NetOps after about 3 seconds.</w:t>
+      </w:r>
+    </w:p>
+    <w:p>
+      <w:pPr>
+        <w:numPr>
+          <w:ilvl w:val="0"/>
+          <w:numId w:val="1032"/>
+        </w:numPr>
+        <w:pStyle w:val="Compact"/>
+      </w:pPr>
+      <w:r>
+        <w:t xml:space="preserve">To stop: click the black window and press</w:t>
+      </w:r>
+      <w:r>
+        <w:t xml:space="preserve"> </w:t>
+      </w:r>
+      <w:r>
+        <w:rPr>
+          <w:bCs/>
+          <w:b/>
+        </w:rPr>
+        <w:t xml:space="preserve">CTRL + C</w:t>
+      </w:r>
+      <w:r>
+        <w:t xml:space="preserve">, then close it.</w:t>
+      </w:r>
+    </w:p>
+    <w:bookmarkEnd w:id="118"/>
+    <w:bookmarkStart w:id="119" w:name="manual-way-vs-code-or-powershell"/>
+    <w:p>
+      <w:pPr>
+        <w:pStyle w:val="Heading3"/>
+      </w:pPr>
+      <w:r>
+        <w:t xml:space="preserve">Manual way (VS Code or PowerShell)</w:t>
+      </w:r>
+    </w:p>
+    <w:p>
+      <w:pPr>
+        <w:numPr>
+          <w:ilvl w:val="0"/>
+          <w:numId w:val="1033"/>
+        </w:numPr>
+      </w:pPr>
+      <w:r>
+        <w:rPr>
+          <w:bCs/>
+          <w:b/>
+        </w:rPr>
+        <w:t xml:space="preserve">Open a terminal:</w:t>
+      </w:r>
+      <w:r>
+        <w:t xml:space="preserve"> </w:t>
+      </w:r>
+      <w:r>
+        <w:t xml:space="preserve">in VS Code,</w:t>
+      </w:r>
+      <w:r>
+        <w:t xml:space="preserve"> </w:t>
+      </w:r>
+      <w:r>
+        <w:rPr>
+          <w:iCs/>
+          <w:i/>
+        </w:rPr>
+        <w:t xml:space="preserve">File → Open Folder</w:t>
+      </w:r>
+      <w:r>
+        <w:t xml:space="preserve"> </w:t>
+      </w:r>
+      <w:r>
+        <w:t xml:space="preserve">→ the NetOps folder, then</w:t>
+      </w:r>
+      <w:r>
+        <w:t xml:space="preserve"> </w:t>
+      </w:r>
+      <w:r>
+        <w:rPr>
+          <w:iCs/>
+          <w:i/>
+        </w:rPr>
+        <w:t xml:space="preserve">Terminal → New Terminal</w:t>
+      </w:r>
+      <w:r>
+        <w:t xml:space="preserve">. Or open PowerShell from the Start menu.</w:t>
+      </w:r>
+    </w:p>
+    <w:p>
+      <w:pPr>
+        <w:numPr>
+          <w:ilvl w:val="0"/>
+          <w:numId w:val="1033"/>
         </w:numPr>
       </w:pPr>
       <w:r>
@@ -22952,7 +23752,7 @@
       <w:pPr>
         <w:numPr>
           <w:ilvl w:val="0"/>
-          <w:numId w:val="1031"/>
+          <w:numId w:val="1033"/>
         </w:numPr>
       </w:pPr>
       <w:r>
@@ -23056,7 +23856,7 @@
       <w:pPr>
         <w:numPr>
           <w:ilvl w:val="0"/>
-          <w:numId w:val="1031"/>
+          <w:numId w:val="1033"/>
         </w:numPr>
       </w:pPr>
       <w:r>
@@ -23127,7 +23927,7 @@
       <w:pPr>
         <w:numPr>
           <w:ilvl w:val="0"/>
-          <w:numId w:val="1031"/>
+          <w:numId w:val="1033"/>
         </w:numPr>
       </w:pPr>
       <w:r>
@@ -23148,7 +23948,7 @@
       <w:pPr>
         <w:numPr>
           <w:ilvl w:val="0"/>
-          <w:numId w:val="1031"/>
+          <w:numId w:val="1033"/>
         </w:numPr>
       </w:pPr>
       <w:r>
@@ -23169,7 +23969,7 @@
       <w:pPr>
         <w:numPr>
           <w:ilvl w:val="0"/>
-          <w:numId w:val="1031"/>
+          <w:numId w:val="1033"/>
         </w:numPr>
       </w:pPr>
       <w:r>
@@ -23202,7 +24002,7 @@
       <w:pPr>
         <w:numPr>
           <w:ilvl w:val="0"/>
-          <w:numId w:val="1031"/>
+          <w:numId w:val="1033"/>
         </w:numPr>
       </w:pPr>
       <w:r>
@@ -23533,7 +24333,38 @@
               <w:jc w:val="left"/>
             </w:pPr>
             <w:r>
-              <w:t xml:space="preserve">The CDN needs internet the first time. Check your connection</w:t>
+              <w:t xml:space="preserve">Press</w:t>
+            </w:r>
+            <w:r>
+              <w:t xml:space="preserve"> </w:t>
+            </w:r>
+            <w:r>
+              <w:rPr>
+                <w:bCs/>
+                <w:b/>
+              </w:rPr>
+              <w:t xml:space="preserve">CTRL + F5</w:t>
+            </w:r>
+            <w:r>
+              <w:t xml:space="preserve"> </w:t>
+            </w:r>
+            <w:r>
+              <w:t xml:space="preserve">to hard-refresh. Check that</w:t>
+            </w:r>
+            <w:r>
+              <w:t xml:space="preserve"> </w:t>
+            </w:r>
+            <w:r>
+              <w:rPr>
+                <w:rStyle w:val="VerbatimChar"/>
+              </w:rPr>
+              <w:t xml:space="preserve">static\vendor\</w:t>
+            </w:r>
+            <w:r>
+              <w:t xml:space="preserve"> </w:t>
+            </w:r>
+            <w:r>
+              <w:t xml:space="preserve">exists (it’s in Git). No internet is needed</w:t>
             </w:r>
           </w:p>
         </w:tc>
@@ -23890,7 +24721,7 @@
       <w:pPr>
         <w:numPr>
           <w:ilvl w:val="0"/>
-          <w:numId w:val="1032"/>
+          <w:numId w:val="1034"/>
         </w:numPr>
         <w:pStyle w:val="Compact"/>
       </w:pPr>
@@ -23924,7 +24755,7 @@
       <w:pPr>
         <w:numPr>
           <w:ilvl w:val="0"/>
-          <w:numId w:val="1032"/>
+          <w:numId w:val="1034"/>
         </w:numPr>
         <w:pStyle w:val="Compact"/>
       </w:pPr>
@@ -23936,7 +24767,7 @@
       <w:pPr>
         <w:numPr>
           <w:ilvl w:val="0"/>
-          <w:numId w:val="1032"/>
+          <w:numId w:val="1034"/>
         </w:numPr>
         <w:pStyle w:val="Compact"/>
       </w:pPr>
@@ -25829,7 +26660,7 @@
       <w:pPr>
         <w:numPr>
           <w:ilvl w:val="0"/>
-          <w:numId w:val="1033"/>
+          <w:numId w:val="1035"/>
         </w:numPr>
         <w:pStyle w:val="Compact"/>
       </w:pPr>
@@ -25851,7 +26682,7 @@
       <w:pPr>
         <w:numPr>
           <w:ilvl w:val="0"/>
-          <w:numId w:val="1033"/>
+          <w:numId w:val="1035"/>
         </w:numPr>
         <w:pStyle w:val="Compact"/>
       </w:pPr>
@@ -25873,7 +26704,7 @@
       <w:pPr>
         <w:numPr>
           <w:ilvl w:val="0"/>
-          <w:numId w:val="1033"/>
+          <w:numId w:val="1035"/>
         </w:numPr>
         <w:pStyle w:val="Compact"/>
       </w:pPr>
@@ -25895,7 +26726,7 @@
       <w:pPr>
         <w:numPr>
           <w:ilvl w:val="0"/>
-          <w:numId w:val="1033"/>
+          <w:numId w:val="1035"/>
         </w:numPr>
         <w:pStyle w:val="Compact"/>
       </w:pPr>
@@ -25929,7 +26760,7 @@
       <w:pPr>
         <w:numPr>
           <w:ilvl w:val="0"/>
-          <w:numId w:val="1033"/>
+          <w:numId w:val="1035"/>
         </w:numPr>
         <w:pStyle w:val="Compact"/>
       </w:pPr>
@@ -25951,7 +26782,7 @@
       <w:pPr>
         <w:numPr>
           <w:ilvl w:val="0"/>
-          <w:numId w:val="1033"/>
+          <w:numId w:val="1035"/>
         </w:numPr>
         <w:pStyle w:val="Compact"/>
       </w:pPr>
@@ -25973,7 +26804,7 @@
       <w:pPr>
         <w:numPr>
           <w:ilvl w:val="0"/>
-          <w:numId w:val="1033"/>
+          <w:numId w:val="1035"/>
         </w:numPr>
         <w:pStyle w:val="Compact"/>
       </w:pPr>
@@ -26011,7 +26842,7 @@
       <w:pPr>
         <w:numPr>
           <w:ilvl w:val="0"/>
-          <w:numId w:val="1033"/>
+          <w:numId w:val="1035"/>
         </w:numPr>
         <w:pStyle w:val="Compact"/>
       </w:pPr>
@@ -26057,7 +26888,7 @@
       <w:pPr>
         <w:numPr>
           <w:ilvl w:val="0"/>
-          <w:numId w:val="1033"/>
+          <w:numId w:val="1035"/>
         </w:numPr>
         <w:pStyle w:val="Compact"/>
       </w:pPr>
@@ -26095,7 +26926,7 @@
       <w:pPr>
         <w:numPr>
           <w:ilvl w:val="0"/>
-          <w:numId w:val="1033"/>
+          <w:numId w:val="1035"/>
         </w:numPr>
         <w:pStyle w:val="Compact"/>
       </w:pPr>
@@ -26104,20 +26935,47 @@
           <w:bCs/>
           <w:b/>
         </w:rPr>
-        <w:t xml:space="preserve">CDN dependency:</w:t>
-      </w:r>
-      <w:r>
-        <w:t xml:space="preserve"> </w:t>
-      </w:r>
-      <w:r>
-        <w:t xml:space="preserve">Bootstrap and Chart.js load from the internet.</w:t>
+        <w:t xml:space="preserve">Library updates are manual:</w:t>
+      </w:r>
+      <w:r>
+        <w:t xml:space="preserve"> </w:t>
+      </w:r>
+      <w:r>
+        <w:t xml:space="preserve">Bootstrap, Chart.js and the fonts are stored at fixed versions in</w:t>
+      </w:r>
+      <w:r>
+        <w:t xml:space="preserve"> </w:t>
+      </w:r>
+      <w:r>
+        <w:rPr>
+          <w:rStyle w:val="VerbatimChar"/>
+        </w:rPr>
+        <w:t xml:space="preserve">static/vendor</w:t>
+      </w:r>
+      <w:r>
+        <w:t xml:space="preserve">. Updating them means downloading new files (the local helper</w:t>
+      </w:r>
+      <w:r>
+        <w:t xml:space="preserve"> </w:t>
+      </w:r>
+      <w:r>
+        <w:rPr>
+          <w:rStyle w:val="VerbatimChar"/>
+        </w:rPr>
+        <w:t xml:space="preserve">_local_download_vendor.bat</w:t>
+      </w:r>
+      <w:r>
+        <w:t xml:space="preserve"> </w:t>
+      </w:r>
+      <w:r>
+        <w:t xml:space="preserve">does this).</w:t>
       </w:r>
     </w:p>
     <w:p>
       <w:pPr>
         <w:numPr>
           <w:ilvl w:val="0"/>
-          <w:numId w:val="1033"/>
+          <w:numId w:val="1035"/>
         </w:numPr>
         <w:pStyle w:val="Compact"/>
       </w:pPr>
@@ -26139,7 +26997,7 @@
       <w:pPr>
         <w:numPr>
           <w:ilvl w:val="0"/>
-          <w:numId w:val="1033"/>
+          <w:numId w:val="1035"/>
         </w:numPr>
         <w:pStyle w:val="Compact"/>
       </w:pPr>
@@ -28440,7 +29298,89 @@
               <w:jc w:val="left"/>
             </w:pPr>
             <w:r>
-              <w:t xml:space="preserve">Theme</w:t>
+              <w:t xml:space="preserve">Theme + floating notification position</w:t>
+            </w:r>
+          </w:p>
+        </w:tc>
+        <w:tc>
+          <w:tcPr/>
+          <w:p>
+            <w:pPr>
+              <w:pStyle w:val="Compact"/>
+              <w:jc w:val="left"/>
+            </w:pPr>
+            <w:r>
+              <w:t xml:space="preserve">Every page</w:t>
+            </w:r>
+          </w:p>
+        </w:tc>
+      </w:tr>
+      <w:tr>
+        <w:tc>
+          <w:tcPr/>
+          <w:p>
+            <w:pPr>
+              <w:pStyle w:val="Compact"/>
+              <w:jc w:val="left"/>
+            </w:pPr>
+            <w:r>
+              <w:rPr>
+                <w:rStyle w:val="VerbatimChar"/>
+              </w:rPr>
+              <w:t xml:space="preserve">static/css/fonts.css</w:t>
+            </w:r>
+          </w:p>
+        </w:tc>
+        <w:tc>
+          <w:tcPr/>
+          <w:p>
+            <w:pPr>
+              <w:pStyle w:val="Compact"/>
+              <w:jc w:val="left"/>
+            </w:pPr>
+            <w:r>
+              <w:t xml:space="preserve">Local font definitions</w:t>
+            </w:r>
+          </w:p>
+        </w:tc>
+        <w:tc>
+          <w:tcPr/>
+          <w:p>
+            <w:pPr>
+              <w:pStyle w:val="Compact"/>
+              <w:jc w:val="left"/>
+            </w:pPr>
+            <w:r>
+              <w:t xml:space="preserve">Every page</w:t>
+            </w:r>
+          </w:p>
+        </w:tc>
+      </w:tr>
+      <w:tr>
+        <w:tc>
+          <w:tcPr/>
+          <w:p>
+            <w:pPr>
+              <w:pStyle w:val="Compact"/>
+              <w:jc w:val="left"/>
+            </w:pPr>
+            <w:r>
+              <w:rPr>
+                <w:rStyle w:val="VerbatimChar"/>
+              </w:rPr>
+              <w:t xml:space="preserve">static/vendor/</w:t>
+            </w:r>
+          </w:p>
+        </w:tc>
+        <w:tc>
+          <w:tcPr/>
+          <w:p>
+            <w:pPr>
+              <w:pStyle w:val="Compact"/>
+              <w:jc w:val="left"/>
+            </w:pPr>
+            <w:r>
+              <w:t xml:space="preserve">Local Bootstrap, Bootstrap Icons, Chart.js, fonts (works offline)</w:t>
             </w:r>
           </w:p>
         </w:tc>
@@ -30281,7 +31221,7 @@
       <w:pPr>
         <w:numPr>
           <w:ilvl w:val="0"/>
-          <w:numId w:val="1034"/>
+          <w:numId w:val="1036"/>
         </w:numPr>
         <w:pStyle w:val="Compact"/>
       </w:pPr>
@@ -30328,7 +31268,7 @@
       <w:pPr>
         <w:numPr>
           <w:ilvl w:val="0"/>
-          <w:numId w:val="1034"/>
+          <w:numId w:val="1036"/>
         </w:numPr>
         <w:pStyle w:val="Compact"/>
       </w:pPr>
@@ -30356,7 +31296,7 @@
       <w:pPr>
         <w:numPr>
           <w:ilvl w:val="0"/>
-          <w:numId w:val="1034"/>
+          <w:numId w:val="1036"/>
         </w:numPr>
         <w:pStyle w:val="Compact"/>
       </w:pPr>
@@ -30378,7 +31318,7 @@
       <w:pPr>
         <w:numPr>
           <w:ilvl w:val="0"/>
-          <w:numId w:val="1034"/>
+          <w:numId w:val="1036"/>
         </w:numPr>
         <w:pStyle w:val="Compact"/>
       </w:pPr>
@@ -30400,7 +31340,7 @@
       <w:pPr>
         <w:numPr>
           <w:ilvl w:val="0"/>
-          <w:numId w:val="1034"/>
+          <w:numId w:val="1036"/>
         </w:numPr>
         <w:pStyle w:val="Compact"/>
       </w:pPr>
@@ -30422,7 +31362,7 @@
       <w:pPr>
         <w:numPr>
           <w:ilvl w:val="0"/>
-          <w:numId w:val="1034"/>
+          <w:numId w:val="1036"/>
         </w:numPr>
         <w:pStyle w:val="Compact"/>
       </w:pPr>
@@ -30450,7 +31390,7 @@
       <w:pPr>
         <w:numPr>
           <w:ilvl w:val="0"/>
-          <w:numId w:val="1034"/>
+          <w:numId w:val="1036"/>
         </w:numPr>
         <w:pStyle w:val="Compact"/>
       </w:pPr>
@@ -30499,7 +31439,7 @@
       <w:pPr>
         <w:numPr>
           <w:ilvl w:val="0"/>
-          <w:numId w:val="1034"/>
+          <w:numId w:val="1036"/>
         </w:numPr>
         <w:pStyle w:val="Compact"/>
       </w:pPr>
@@ -30521,7 +31461,7 @@
       <w:pPr>
         <w:numPr>
           <w:ilvl w:val="0"/>
-          <w:numId w:val="1034"/>
+          <w:numId w:val="1036"/>
         </w:numPr>
         <w:pStyle w:val="Compact"/>
       </w:pPr>
@@ -30530,20 +31470,32 @@
           <w:bCs/>
           <w:b/>
         </w:rPr>
-        <w:t xml:space="preserve">Honesty:</w:t>
-      </w:r>
-      <w:r>
-        <w:t xml:space="preserve"> </w:t>
-      </w:r>
-      <w:r>
-        <w:t xml:space="preserve">simulated data, not AI, not production, no background polling, no dashboard login.</w:t>
+        <w:t xml:space="preserve">Works offline:</w:t>
+      </w:r>
+      <w:r>
+        <w:t xml:space="preserve"> </w:t>
+      </w:r>
+      <w:r>
+        <w:t xml:space="preserve">all libraries and fonts are bundled in</w:t>
+      </w:r>
+      <w:r>
+        <w:t xml:space="preserve"> </w:t>
+      </w:r>
+      <w:r>
+        <w:rPr>
+          <w:rStyle w:val="VerbatimChar"/>
+        </w:rPr>
+        <w:t xml:space="preserve">static/vendor</w:t>
+      </w:r>
+      <w:r>
+        <w:t xml:space="preserve">, so Wi-Fi problems can’t break the demo.</w:t>
       </w:r>
     </w:p>
     <w:p>
       <w:pPr>
         <w:numPr>
           <w:ilvl w:val="0"/>
-          <w:numId w:val="1034"/>
+          <w:numId w:val="1036"/>
         </w:numPr>
         <w:pStyle w:val="Compact"/>
       </w:pPr>
@@ -30552,20 +31504,42 @@
           <w:bCs/>
           <w:b/>
         </w:rPr>
-        <w:t xml:space="preserve">Future:</w:t>
-      </w:r>
-      <w:r>
-        <w:t xml:space="preserve"> </w:t>
-      </w:r>
-      <w:r>
-        <w:t xml:space="preserve">SNMP / Prometheus → same engine; PostgreSQL; scheduled workers; alerts; auth/RBAC; Docker; cloud.</w:t>
+        <w:t xml:space="preserve">Honesty:</w:t>
+      </w:r>
+      <w:r>
+        <w:t xml:space="preserve"> </w:t>
+      </w:r>
+      <w:r>
+        <w:t xml:space="preserve">simulated data, not AI, not production, no background polling, no dashboard login.</w:t>
       </w:r>
     </w:p>
     <w:p>
       <w:pPr>
         <w:numPr>
           <w:ilvl w:val="0"/>
-          <w:numId w:val="1034"/>
+          <w:numId w:val="1036"/>
+        </w:numPr>
+        <w:pStyle w:val="Compact"/>
+      </w:pPr>
+      <w:r>
+        <w:rPr>
+          <w:bCs/>
+          <w:b/>
+        </w:rPr>
+        <w:t xml:space="preserve">Future:</w:t>
+      </w:r>
+      <w:r>
+        <w:t xml:space="preserve"> </w:t>
+      </w:r>
+      <w:r>
+        <w:t xml:space="preserve">SNMP / Prometheus → same engine; PostgreSQL; scheduled workers; alerts; auth/RBAC; Docker; cloud.</w:t>
+      </w:r>
+    </w:p>
+    <w:p>
+      <w:pPr>
+        <w:numPr>
+          <w:ilvl w:val="0"/>
+          <w:numId w:val="1036"/>
         </w:numPr>
         <w:pStyle w:val="Compact"/>
       </w:pPr>
@@ -31097,6 +32071,12 @@
     <w:abstractNumId w:val="991"/>
   </w:num>
   <w:num w:numId="1030">
+    <w:abstractNumId w:val="991"/>
+  </w:num>
+  <w:num w:numId="1031">
+    <w:abstractNumId w:val="991"/>
+  </w:num>
+  <w:num w:numId="1032">
     <w:abstractNumId w:val="99411"/>
     <w:lvlOverride w:ilvl="0">
       <w:startOverride w:val="1"/>
@@ -31125,39 +32105,6 @@
     <w:lvlOverride w:ilvl="8">
       <w:startOverride w:val="1"/>
     </w:lvlOverride>
-  </w:num>
-  <w:num w:numId="1031">
-    <w:abstractNumId w:val="99411"/>
-    <w:lvlOverride w:ilvl="0">
-      <w:startOverride w:val="1"/>
-    </w:lvlOverride>
-    <w:lvlOverride w:ilvl="1">
-      <w:startOverride w:val="1"/>
-    </w:lvlOverride>
-    <w:lvlOverride w:ilvl="2">
-      <w:startOverride w:val="1"/>
-    </w:lvlOverride>
-    <w:lvlOverride w:ilvl="3">
-      <w:startOverride w:val="1"/>
-    </w:lvlOverride>
-    <w:lvlOverride w:ilvl="4">
-      <w:startOverride w:val="1"/>
-    </w:lvlOverride>
-    <w:lvlOverride w:ilvl="5">
-      <w:startOverride w:val="1"/>
-    </w:lvlOverride>
-    <w:lvlOverride w:ilvl="6">
-      <w:startOverride w:val="1"/>
-    </w:lvlOverride>
-    <w:lvlOverride w:ilvl="7">
-      <w:startOverride w:val="1"/>
-    </w:lvlOverride>
-    <w:lvlOverride w:ilvl="8">
-      <w:startOverride w:val="1"/>
-    </w:lvlOverride>
-  </w:num>
-  <w:num w:numId="1032">
-    <w:abstractNumId w:val="991"/>
   </w:num>
   <w:num w:numId="1033">
     <w:abstractNumId w:val="99411"/>
@@ -31190,6 +32137,39 @@
     </w:lvlOverride>
   </w:num>
   <w:num w:numId="1034">
+    <w:abstractNumId w:val="991"/>
+  </w:num>
+  <w:num w:numId="1035">
+    <w:abstractNumId w:val="99411"/>
+    <w:lvlOverride w:ilvl="0">
+      <w:startOverride w:val="1"/>
+    </w:lvlOverride>
+    <w:lvlOverride w:ilvl="1">
+      <w:startOverride w:val="1"/>
+    </w:lvlOverride>
+    <w:lvlOverride w:ilvl="2">
+      <w:startOverride w:val="1"/>
+    </w:lvlOverride>
+    <w:lvlOverride w:ilvl="3">
+      <w:startOverride w:val="1"/>
+    </w:lvlOverride>
+    <w:lvlOverride w:ilvl="4">
+      <w:startOverride w:val="1"/>
+    </w:lvlOverride>
+    <w:lvlOverride w:ilvl="5">
+      <w:startOverride w:val="1"/>
+    </w:lvlOverride>
+    <w:lvlOverride w:ilvl="6">
+      <w:startOverride w:val="1"/>
+    </w:lvlOverride>
+    <w:lvlOverride w:ilvl="7">
+      <w:startOverride w:val="1"/>
+    </w:lvlOverride>
+    <w:lvlOverride w:ilvl="8">
+      <w:startOverride w:val="1"/>
+    </w:lvlOverride>
+  </w:num>
+  <w:num w:numId="1036">
     <w:abstractNumId w:val="991"/>
   </w:num>
 </w:numbering>

</xml_diff>